<commit_message>
docs(er): corrigir PK da tabela da relacao em Regras 3 e 5 + prefixo FK_ para FKs simples
Correccao pedida pelo docente:

1. Regra 5 (1:N nao obrigatoria) — PK da tabela da relacao e a PK do
   LADO N (nao e composta)
   - Caso 1 REQUISITAR: PK = cota (e nao (Num_Leitor, cota)), porque cada
     livro so esta emprestado a 1 leitor de cada vez
   - Num_Leitor fica apenas como FK (prefixo FK_)

2. Regra 3 (1:1 sem obrigatoriedade) — PK da tabela da relacao e uma
   das PKs; a outra fica como FK_
   - Exemplo APADRINHAMENTO no index.md corrigido

3. Regra 6 (N:M) — PK continua composta de ambas; ambos os atributos
   sublinhados (sem FK_ adicional, ja que contexto N:M implica FK)

4. Prefixo FK_ adoptado para FKs simples em todo o modulo
   - index.md, aula-07.md, casos-guiados.md, erros-frequentes.md
   - generate-er-worksheets.js: dados dos 4 casos solucao actualizados

Co-Authored-By: Claude Opus 4.6 <noreply@anthropic.com>
</commit_message>
<xml_diff>
--- a/docs/er/worksheets/worksheet-guiado-1-biblioteca-solucao.docx
+++ b/docs/er/worksheets/worksheet-guiado-1-biblioteca-solucao.docx
@@ -3378,7 +3378,7 @@
                 <w:sz w:val="20"/>
                 <w:szCs w:val="20"/>
               </w:rPr>
-              <w:t xml:space="preserve">Tabela da relação com ambas as PKs</w:t>
+              <w:t xml:space="preserve">PK do lado N (cota); PK do lado 1 fica como FK_</w:t>
             </w:r>
           </w:p>
         </w:tc>
@@ -3493,7 +3493,7 @@
           <w:szCs w:val="20"/>
           <w:u w:val="single"/>
         </w:rPr>
-        <w:t xml:space="preserve">Num_Leitor</w:t>
+        <w:t xml:space="preserve">cota</w:t>
       </w:r>
       <w:r>
         <w:rPr>
@@ -3502,26 +3502,7 @@
           <w:sz w:val="20"/>
           <w:szCs w:val="20"/>
         </w:rPr>
-        <w:t xml:space="preserve">, </w:t>
-      </w:r>
-      <w:r>
-        <w:rPr>
-          <w:rFonts w:ascii="Consolas" w:cs="Consolas" w:eastAsia="Consolas" w:hAnsi="Consolas"/>
-          <w:color w:val="1F3864"/>
-          <w:sz w:val="20"/>
-          <w:szCs w:val="20"/>
-          <w:u w:val="single"/>
-        </w:rPr>
-        <w:t xml:space="preserve">cota</w:t>
-      </w:r>
-      <w:r>
-        <w:rPr>
-          <w:rFonts w:ascii="Consolas" w:cs="Consolas" w:eastAsia="Consolas" w:hAnsi="Consolas"/>
-          <w:color w:val="1F3864"/>
-          <w:sz w:val="20"/>
-          <w:szCs w:val="20"/>
-        </w:rPr>
-        <w:t xml:space="preserve">)</w:t>
+        <w:t xml:space="preserve">, FK_Num_Leitor)</w:t>
       </w:r>
     </w:p>
     <w:p>
@@ -3535,7 +3516,7 @@
           <w:sz w:val="20"/>
           <w:szCs w:val="20"/>
         </w:rPr>
-        <w:t xml:space="preserve">Nota: Um livro só está emprestado a um leitor de cada vez, mas sem obrigatoriedade → Regra 5 (não Regra 4 nem 6)</w:t>
+        <w:t xml:space="preserve">Nota: PK é só 'cota' porque cada livro só está emprestado a 1 leitor de cada vez → cota é única em REQUISITAR. Num_Leitor fica apenas como FK.</w:t>
       </w:r>
     </w:p>
     <w:p>
@@ -3863,7 +3844,7 @@
                 <w:sz w:val="20"/>
                 <w:szCs w:val="20"/>
               </w:rPr>
-              <w:t xml:space="preserve">Tabela da relação com ambas as PKs</w:t>
+              <w:t xml:space="preserve">Tabela da relação com PK composta (ambas PKs)</w:t>
             </w:r>
           </w:p>
         </w:tc>
@@ -3974,6 +3955,20 @@
           <w:szCs w:val="20"/>
         </w:rPr>
         <w:t xml:space="preserve">)</w:t>
+      </w:r>
+    </w:p>
+    <w:p>
+      <w:pPr>
+        <w:spacing w:after="120"/>
+      </w:pPr>
+      <w:r>
+        <w:rPr>
+          <w:i/>
+          <w:iCs/>
+          <w:sz w:val="20"/>
+          <w:szCs w:val="20"/>
+        </w:rPr>
+        <w:t xml:space="preserve">Nota: Em N:M a PK é composta — ambos os atributos são também FKs</w:t>
       </w:r>
     </w:p>
     <w:p>
@@ -4363,7 +4358,7 @@
                 <w:sz w:val="20"/>
                 <w:szCs w:val="20"/>
               </w:rPr>
-              <w:t xml:space="preserve">(Num_Leitor, cota)</w:t>
+              <w:t xml:space="preserve">cota (um livro está emprestado a 1 leitor de cada vez)</w:t>
             </w:r>
           </w:p>
         </w:tc>
@@ -4971,7 +4966,7 @@
                 <w:sz w:val="20"/>
                 <w:szCs w:val="20"/>
               </w:rPr>
-              <w:t xml:space="preserve">(Num_Leitor, cota)</w:t>
+              <w:t xml:space="preserve">cota</w:t>
             </w:r>
           </w:p>
         </w:tc>
@@ -4997,7 +4992,7 @@
                 <w:sz w:val="20"/>
                 <w:szCs w:val="20"/>
               </w:rPr>
-              <w:t xml:space="preserve">PK composta — uma requisição activa por par leitor-livro</w:t>
+              <w:t xml:space="preserve">Num_Leitor repete-se (um leitor tem vários livros); cota é única (Regra 5)</w:t>
             </w:r>
           </w:p>
         </w:tc>
@@ -5077,7 +5072,7 @@
                 <w:sz w:val="20"/>
                 <w:szCs w:val="20"/>
               </w:rPr>
-              <w:t xml:space="preserve">PK composta — um autor só co-assina uma vez o mesmo livro</w:t>
+              <w:t xml:space="preserve">PK composta (N:M) — um autor co-assina uma vez o mesmo livro</w:t>
             </w:r>
           </w:p>
         </w:tc>
@@ -5375,7 +5370,7 @@
           <w:szCs w:val="22"/>
           <w:u w:val="single"/>
         </w:rPr>
-        <w:t xml:space="preserve">Num_Leitor</w:t>
+        <w:t xml:space="preserve">cota</w:t>
       </w:r>
       <w:r>
         <w:rPr>
@@ -5384,26 +5379,7 @@
           <w:sz w:val="22"/>
           <w:szCs w:val="22"/>
         </w:rPr>
-        <w:t xml:space="preserve">, </w:t>
-      </w:r>
-      <w:r>
-        <w:rPr>
-          <w:rFonts w:ascii="Consolas" w:cs="Consolas" w:eastAsia="Consolas" w:hAnsi="Consolas"/>
-          <w:color w:val="1F3864"/>
-          <w:sz w:val="22"/>
-          <w:szCs w:val="22"/>
-          <w:u w:val="single"/>
-        </w:rPr>
-        <w:t xml:space="preserve">cota</w:t>
-      </w:r>
-      <w:r>
-        <w:rPr>
-          <w:rFonts w:ascii="Consolas" w:cs="Consolas" w:eastAsia="Consolas" w:hAnsi="Consolas"/>
-          <w:color w:val="1F3864"/>
-          <w:sz w:val="22"/>
-          <w:szCs w:val="22"/>
-        </w:rPr>
-        <w:t xml:space="preserve">)</w:t>
+        <w:t xml:space="preserve">, FK_Num_Leitor)</w:t>
       </w:r>
     </w:p>
     <w:p>

</xml_diff>